<commit_message>
Update CV to remove publications and rename research section
</commit_message>
<xml_diff>
--- a/PhD_Application_Prep/Adnan_Rauf_Academic_CV.docx
+++ b/PhD_Application_Prep/Adnan_Rauf_Academic_CV.docx
@@ -86,12 +86,12 @@
         <w:pStyle w:val="Heading1"/>
       </w:pPr>
       <w:r>
-        <w:t>Research Experience &amp; Publications</w:t>
+        <w:t>Research Experience &amp; Academic Projects</w:t>
       </w:r>
     </w:p>
     <w:p>
       <w:r>
-        <w:t>• [Insert any publications, conference presentations, or MS research papers here]</w:t>
+        <w:t>• Currently conducting graduate-level research for MS Thesis in Public Administration.</w:t>
       </w:r>
     </w:p>
     <w:p>

</xml_diff>